<commit_message>
cleaning up word export formatting
</commit_message>
<xml_diff>
--- a/app/assets/documents/inspection_template.docx
+++ b/app/assets/documents/inspection_template.docx
@@ -18,10 +18,10 @@
         <w:tblLook w:val="04A0" w:firstRow="1" w:lastRow="0" w:firstColumn="1" w:lastColumn="0" w:noHBand="0" w:noVBand="1"/>
       </w:tblPr>
       <w:tblGrid>
-        <w:gridCol w:w="2615"/>
-        <w:gridCol w:w="4482"/>
-        <w:gridCol w:w="1704"/>
-        <w:gridCol w:w="2257"/>
+        <w:gridCol w:w="2584"/>
+        <w:gridCol w:w="4431"/>
+        <w:gridCol w:w="1690"/>
+        <w:gridCol w:w="2353"/>
       </w:tblGrid>
       <w:tr>
         <w:tc>
@@ -101,10 +101,6 @@
             </w:r>
             <w:proofErr w:type="spellStart"/>
             <w:r>
-              <w:rPr>
-                <w:sz w:val="18"/>
-                <w:szCs w:val="18"/>
-              </w:rPr>
               <w:t>contract_number</w:t>
             </w:r>
             <w:proofErr w:type="spellEnd"/>
@@ -949,7 +945,7 @@
               <w:t xml:space="preserve"> saf_status </w:t>
             </w:r>
             <w:r>
-              <w:t>}},</w:t>
+              <w:t>}}</w:t>
             </w:r>
             <w:r>
               <w:t xml:space="preserve"> </w:t>
@@ -1221,6 +1217,12 @@
             </w:r>
           </w:p>
           <w:p>
+            <w:pPr>
+              <w:rPr>
+                <w:b/>
+                <w:bCs/>
+              </w:rPr>
+            </w:pPr>
             <w:r>
               <w:rPr>
                 <w:b/>
@@ -1247,24 +1249,18 @@
           </w:p>
           <w:p>
             <w:pPr>
-              <w:spacing w:before="120" w:after="60"/>
-            </w:pPr>
-            <w:r>
-              <w:t>{{</w:t>
-            </w:r>
-            <w:r>
-              <w:t xml:space="preserve"> commentary </w:t>
-            </w:r>
-            <w:r>
-              <w:t>}}</w:t>
-            </w:r>
-          </w:p>
-          <w:p>
-            <w:pPr>
-              <w:pStyle w:val="Heading2"/>
-              <w:ind w:left="0"/>
-            </w:pPr>
-          </w:p>
+              <w:rPr>
+                <w:b/>
+                <w:bCs/>
+              </w:rPr>
+            </w:pPr>
+          </w:p>
+          <w:p>
+            <w:r>
+              <w:t>{{ commentary }}</w:t>
+            </w:r>
+          </w:p>
+          <w:p/>
           <w:p>
             <w:pPr>
               <w:pStyle w:val="Heading2"/>
@@ -4977,6 +4973,114 @@
               </w:rPr>
               <w:t>].remarks }}</w:t>
             </w:r>
+          </w:p>
+        </w:tc>
+      </w:tr>
+      <w:tr>
+        <w:trPr>
+          <w:trHeight w:val="256"/>
+        </w:trPr>
+        <w:tc>
+          <w:tcPr>
+            <w:tcW w:w="2057" w:type="dxa"/>
+            <w:tcBorders>
+              <w:top w:val="single" w:sz="4" w:space="0" w:color="000000"/>
+              <w:left w:val="single" w:sz="4" w:space="0" w:color="000000"/>
+              <w:bottom w:val="single" w:sz="4" w:space="0" w:color="000000"/>
+              <w:right w:val="single" w:sz="4" w:space="0" w:color="000000"/>
+            </w:tcBorders>
+          </w:tcPr>
+          <w:p>
+            <w:pPr>
+              <w:ind w:left="0"/>
+              <w:jc w:val="both"/>
+              <w:rPr>
+                <w:sz w:val="24"/>
+                <w:szCs w:val="24"/>
+              </w:rPr>
+            </w:pPr>
+          </w:p>
+        </w:tc>
+        <w:tc>
+          <w:tcPr>
+            <w:tcW w:w="5405" w:type="dxa"/>
+            <w:gridSpan w:val="7"/>
+            <w:tcBorders>
+              <w:top w:val="single" w:sz="4" w:space="0" w:color="000000"/>
+              <w:left w:val="single" w:sz="4" w:space="0" w:color="000000"/>
+              <w:bottom w:val="single" w:sz="4" w:space="0" w:color="000000"/>
+              <w:right w:val="single" w:sz="4" w:space="0" w:color="000000"/>
+            </w:tcBorders>
+          </w:tcPr>
+          <w:p>
+            <w:pPr>
+              <w:ind w:left="0"/>
+              <w:jc w:val="both"/>
+            </w:pPr>
+          </w:p>
+        </w:tc>
+        <w:tc>
+          <w:tcPr>
+            <w:tcW w:w="1224" w:type="dxa"/>
+            <w:tcBorders>
+              <w:top w:val="single" w:sz="4" w:space="0" w:color="000000"/>
+              <w:left w:val="single" w:sz="4" w:space="0" w:color="000000"/>
+              <w:bottom w:val="single" w:sz="4" w:space="0" w:color="000000"/>
+              <w:right w:val="single" w:sz="4" w:space="0" w:color="000000"/>
+            </w:tcBorders>
+          </w:tcPr>
+          <w:p>
+            <w:pPr>
+              <w:ind w:left="0"/>
+              <w:jc w:val="both"/>
+              <w:rPr>
+                <w:sz w:val="18"/>
+                <w:szCs w:val="18"/>
+              </w:rPr>
+            </w:pPr>
+          </w:p>
+        </w:tc>
+        <w:tc>
+          <w:tcPr>
+            <w:tcW w:w="1405" w:type="dxa"/>
+            <w:gridSpan w:val="2"/>
+            <w:tcBorders>
+              <w:top w:val="single" w:sz="4" w:space="0" w:color="000000"/>
+              <w:left w:val="single" w:sz="4" w:space="0" w:color="000000"/>
+              <w:bottom w:val="single" w:sz="4" w:space="0" w:color="000000"/>
+              <w:right w:val="single" w:sz="4" w:space="0" w:color="000000"/>
+            </w:tcBorders>
+          </w:tcPr>
+          <w:p>
+            <w:pPr>
+              <w:ind w:left="0"/>
+              <w:jc w:val="both"/>
+              <w:rPr>
+                <w:sz w:val="18"/>
+                <w:szCs w:val="18"/>
+              </w:rPr>
+            </w:pPr>
+          </w:p>
+        </w:tc>
+        <w:tc>
+          <w:tcPr>
+            <w:tcW w:w="1429" w:type="dxa"/>
+            <w:tcBorders>
+              <w:top w:val="single" w:sz="4" w:space="0" w:color="000000"/>
+              <w:left w:val="single" w:sz="4" w:space="0" w:color="000000"/>
+              <w:bottom w:val="single" w:sz="4" w:space="0" w:color="000000"/>
+              <w:right w:val="single" w:sz="4" w:space="0" w:color="000000"/>
+            </w:tcBorders>
+          </w:tcPr>
+          <w:p>
+            <w:pPr>
+              <w:ind w:left="0"/>
+              <w:jc w:val="both"/>
+              <w:rPr>
+                <w:sz w:val="16"/>
+                <w:szCs w:val="16"/>
+              </w:rPr>
+            </w:pPr>
           </w:p>
         </w:tc>
       </w:tr>

</xml_diff>

<commit_message>
feat: overhaul AI commentary prompts, update Azure OpenAI config, and misc fixes
- Fix broken weather pipeline (format_weather now parses periods array)
- Rewrite Pass 1 prompt to filter narratable facts, exclude workforce/equipment/boilerplate
- Rewrite Pass 2 prompt with inspector-as-writer voice and real CommentaryContext examples
- Add language/tone rules to prevent informal shorthand and vague quality assessments
- Clean up data flow with conditional sections (deficiency, safety, bid item checklists)
- Bump MAX_TOKENS from 32k to 48k for gpt54nano reasoning overhead
- Update Azure config: new endpoint, deployment name (gpt54nano), API version (2025-04-01-preview)
- Update AZURE_OPENAI_MODEL_SETUP.md to reflect current deployment
- Update docx template and exporter fixes

Co-Authored-By: Claude Opus 4.6 (1M context) <noreply@anthropic.com>
</commit_message>
<xml_diff>
--- a/app/assets/documents/inspection_template.docx
+++ b/app/assets/documents/inspection_template.docx
@@ -1270,6 +1270,1231 @@
           </w:p>
           <w:p/>
           <w:p>
+            <w:r>
+              <w:t xml:space="preserve">{% if </w:t>
+            </w:r>
+            <w:proofErr w:type="spellStart"/>
+            <w:r>
+              <w:t>has_core_</w:t>
+            </w:r>
+            <w:proofErr w:type="gramStart"/>
+            <w:r>
+              <w:t>locations</w:t>
+            </w:r>
+            <w:proofErr w:type="spellEnd"/>
+            <w:r>
+              <w:t xml:space="preserve"> %}</w:t>
+            </w:r>
+            <w:proofErr w:type="gramEnd"/>
+          </w:p>
+          <w:p>
+            <w:r>
+              <w:t xml:space="preserve">Core Sample Locations — Lot {{ </w:t>
+            </w:r>
+            <w:proofErr w:type="spellStart"/>
+            <w:r>
+              <w:t>core_lot_</w:t>
+            </w:r>
+            <w:proofErr w:type="gramStart"/>
+            <w:r>
+              <w:t>number</w:t>
+            </w:r>
+            <w:proofErr w:type="spellEnd"/>
+            <w:r>
+              <w:t xml:space="preserve"> }} ({{ </w:t>
+            </w:r>
+            <w:proofErr w:type="spellStart"/>
+            <w:proofErr w:type="gramEnd"/>
+            <w:r>
+              <w:t>core_mix_</w:t>
+            </w:r>
+            <w:proofErr w:type="gramStart"/>
+            <w:r>
+              <w:t>type</w:t>
+            </w:r>
+            <w:proofErr w:type="spellEnd"/>
+            <w:r>
+              <w:t xml:space="preserve"> }}, {{</w:t>
+            </w:r>
+            <w:proofErr w:type="gramEnd"/>
+            <w:r>
+              <w:t xml:space="preserve"> </w:t>
+            </w:r>
+            <w:proofErr w:type="spellStart"/>
+            <w:r>
+              <w:t>core_</w:t>
+            </w:r>
+            <w:proofErr w:type="gramStart"/>
+            <w:r>
+              <w:t>plant</w:t>
+            </w:r>
+            <w:proofErr w:type="spellEnd"/>
+            <w:r>
+              <w:t xml:space="preserve"> }})</w:t>
+            </w:r>
+            <w:proofErr w:type="gramEnd"/>
+          </w:p>
+          <w:p>
+            <w:r>
+              <w:t xml:space="preserve">{{ </w:t>
+            </w:r>
+            <w:proofErr w:type="spellStart"/>
+            <w:r>
+              <w:t>core_count</w:t>
+            </w:r>
+            <w:proofErr w:type="spellEnd"/>
+            <w:r>
+              <w:t xml:space="preserve"> }} cores ({{ </w:t>
+            </w:r>
+            <w:proofErr w:type="spellStart"/>
+            <w:r>
+              <w:t>core_mat_count</w:t>
+            </w:r>
+            <w:proofErr w:type="spellEnd"/>
+            <w:r>
+              <w:t xml:space="preserve"> }} mat, {{ </w:t>
+            </w:r>
+            <w:proofErr w:type="spellStart"/>
+            <w:r>
+              <w:t>core_joint_count</w:t>
+            </w:r>
+            <w:proofErr w:type="spellEnd"/>
+            <w:r>
+              <w:t xml:space="preserve"> }} joint)</w:t>
+            </w:r>
+          </w:p>
+          <w:tbl>
+            <w:tblPr>
+              <w:tblStyle w:val="TableGrid0"/>
+              <w:tblW w:w="10243" w:type="dxa"/>
+              <w:tblInd w:w="263" w:type="dxa"/>
+              <w:tblLook w:val="04A0" w:firstRow="1" w:lastRow="0" w:firstColumn="1" w:lastColumn="0" w:noHBand="0" w:noVBand="1"/>
+            </w:tblPr>
+            <w:tblGrid>
+              <w:gridCol w:w="2232"/>
+              <w:gridCol w:w="2160"/>
+              <w:gridCol w:w="3290"/>
+              <w:gridCol w:w="2561"/>
+            </w:tblGrid>
+            <w:tr>
+              <w:trPr>
+                <w:trHeight w:val="322"/>
+              </w:trPr>
+              <w:tc>
+                <w:tcPr>
+                  <w:tcW w:w="2232" w:type="dxa"/>
+                </w:tcPr>
+                <w:p>
+                  <w:pPr>
+                    <w:ind w:left="0"/>
+                  </w:pPr>
+                  <w:r>
+                    <w:t>Mark</w:t>
+                  </w:r>
+                </w:p>
+              </w:tc>
+              <w:tc>
+                <w:tcPr>
+                  <w:tcW w:w="2160" w:type="dxa"/>
+                </w:tcPr>
+                <w:p>
+                  <w:pPr>
+                    <w:ind w:left="0"/>
+                  </w:pPr>
+                  <w:r>
+                    <w:t>Lane</w:t>
+                  </w:r>
+                </w:p>
+              </w:tc>
+              <w:tc>
+                <w:tcPr>
+                  <w:tcW w:w="3290" w:type="dxa"/>
+                </w:tcPr>
+                <w:p>
+                  <w:pPr>
+                    <w:ind w:left="0"/>
+                  </w:pPr>
+                  <w:r>
+                    <w:t>Lane Station</w:t>
+                  </w:r>
+                </w:p>
+              </w:tc>
+              <w:tc>
+                <w:tcPr>
+                  <w:tcW w:w="2561" w:type="dxa"/>
+                </w:tcPr>
+                <w:p>
+                  <w:pPr>
+                    <w:ind w:left="0"/>
+                  </w:pPr>
+                  <w:r>
+                    <w:t>Offset</w:t>
+                  </w:r>
+                </w:p>
+              </w:tc>
+            </w:tr>
+            <w:tr>
+              <w:trPr>
+                <w:trHeight w:val="322"/>
+              </w:trPr>
+              <w:tc>
+                <w:tcPr>
+                  <w:tcW w:w="2232" w:type="dxa"/>
+                </w:tcPr>
+                <w:p>
+                  <w:pPr>
+                    <w:ind w:left="0"/>
+                  </w:pPr>
+                  <w:r>
+                    <w:t>{{ cores[0].mark }}</w:t>
+                  </w:r>
+                </w:p>
+                <w:p>
+                  <w:pPr>
+                    <w:ind w:left="0"/>
+                  </w:pPr>
+                </w:p>
+              </w:tc>
+              <w:tc>
+                <w:tcPr>
+                  <w:tcW w:w="2160" w:type="dxa"/>
+                </w:tcPr>
+                <w:p>
+                  <w:pPr>
+                    <w:ind w:left="0"/>
+                  </w:pPr>
+                  <w:r>
+                    <w:t>{{ cores[</w:t>
+                  </w:r>
+                  <w:r>
+                    <w:t>0</w:t>
+                  </w:r>
+                  <w:r>
+                    <w:t>].lane }}</w:t>
+                  </w:r>
+                </w:p>
+                <w:p>
+                  <w:pPr>
+                    <w:ind w:left="0"/>
+                  </w:pPr>
+                </w:p>
+              </w:tc>
+              <w:tc>
+                <w:tcPr>
+                  <w:tcW w:w="3290" w:type="dxa"/>
+                </w:tcPr>
+                <w:p>
+                  <w:pPr>
+                    <w:ind w:left="0"/>
+                  </w:pPr>
+                  <w:r>
+                    <w:t>{{ cores[0].</w:t>
+                  </w:r>
+                  <w:proofErr w:type="spellStart"/>
+                  <w:r>
+                    <w:t>lane_station_ft</w:t>
+                  </w:r>
+                  <w:proofErr w:type="spellEnd"/>
+                  <w:r>
+                    <w:t xml:space="preserve"> }}</w:t>
+                  </w:r>
+                </w:p>
+                <w:p>
+                  <w:pPr>
+                    <w:ind w:left="0"/>
+                  </w:pPr>
+                </w:p>
+              </w:tc>
+              <w:tc>
+                <w:tcPr>
+                  <w:tcW w:w="2561" w:type="dxa"/>
+                </w:tcPr>
+                <w:p>
+                  <w:pPr>
+                    <w:ind w:left="0"/>
+                  </w:pPr>
+                  <w:r>
+                    <w:t>{{ cores[0].</w:t>
+                  </w:r>
+                  <w:proofErr w:type="spellStart"/>
+                  <w:r>
+                    <w:t>offset_ft</w:t>
+                  </w:r>
+                  <w:proofErr w:type="spellEnd"/>
+                  <w:r>
+                    <w:t xml:space="preserve"> }}</w:t>
+                  </w:r>
+                </w:p>
+                <w:p>
+                  <w:pPr>
+                    <w:ind w:left="0"/>
+                  </w:pPr>
+                </w:p>
+              </w:tc>
+            </w:tr>
+            <w:tr>
+              <w:trPr>
+                <w:trHeight w:val="322"/>
+              </w:trPr>
+              <w:tc>
+                <w:tcPr>
+                  <w:tcW w:w="2232" w:type="dxa"/>
+                </w:tcPr>
+                <w:p>
+                  <w:pPr>
+                    <w:ind w:left="0"/>
+                  </w:pPr>
+                  <w:r>
+                    <w:t>{{ cores[</w:t>
+                  </w:r>
+                  <w:r>
+                    <w:t>1</w:t>
+                  </w:r>
+                  <w:r>
+                    <w:t>].mark }}</w:t>
+                  </w:r>
+                </w:p>
+                <w:p>
+                  <w:pPr>
+                    <w:ind w:left="0"/>
+                  </w:pPr>
+                </w:p>
+              </w:tc>
+              <w:tc>
+                <w:tcPr>
+                  <w:tcW w:w="2160" w:type="dxa"/>
+                </w:tcPr>
+                <w:p>
+                  <w:pPr>
+                    <w:ind w:left="0"/>
+                  </w:pPr>
+                  <w:r>
+                    <w:t>{{ cores[</w:t>
+                  </w:r>
+                  <w:r>
+                    <w:t>1</w:t>
+                  </w:r>
+                  <w:r>
+                    <w:t>].lane }}</w:t>
+                  </w:r>
+                </w:p>
+                <w:p>
+                  <w:pPr>
+                    <w:ind w:left="0"/>
+                  </w:pPr>
+                </w:p>
+              </w:tc>
+              <w:tc>
+                <w:tcPr>
+                  <w:tcW w:w="3290" w:type="dxa"/>
+                </w:tcPr>
+                <w:p>
+                  <w:pPr>
+                    <w:ind w:left="0"/>
+                  </w:pPr>
+                  <w:r>
+                    <w:t>{{ cores[</w:t>
+                  </w:r>
+                  <w:r>
+                    <w:t>1</w:t>
+                  </w:r>
+                  <w:r>
+                    <w:t>].</w:t>
+                  </w:r>
+                  <w:proofErr w:type="spellStart"/>
+                  <w:r>
+                    <w:t>lane_station_ft</w:t>
+                  </w:r>
+                  <w:proofErr w:type="spellEnd"/>
+                  <w:r>
+                    <w:t xml:space="preserve"> }}</w:t>
+                  </w:r>
+                </w:p>
+                <w:p>
+                  <w:pPr>
+                    <w:ind w:left="0"/>
+                  </w:pPr>
+                </w:p>
+              </w:tc>
+              <w:tc>
+                <w:tcPr>
+                  <w:tcW w:w="2561" w:type="dxa"/>
+                </w:tcPr>
+                <w:p>
+                  <w:pPr>
+                    <w:ind w:left="0"/>
+                  </w:pPr>
+                  <w:r>
+                    <w:t>{{ cores[</w:t>
+                  </w:r>
+                  <w:r>
+                    <w:t>1</w:t>
+                  </w:r>
+                  <w:r>
+                    <w:t>].</w:t>
+                  </w:r>
+                  <w:proofErr w:type="spellStart"/>
+                  <w:r>
+                    <w:t>offset_ft</w:t>
+                  </w:r>
+                  <w:proofErr w:type="spellEnd"/>
+                  <w:r>
+                    <w:t xml:space="preserve"> }}</w:t>
+                  </w:r>
+                </w:p>
+                <w:p>
+                  <w:pPr>
+                    <w:ind w:left="0"/>
+                  </w:pPr>
+                </w:p>
+              </w:tc>
+            </w:tr>
+            <w:tr>
+              <w:trPr>
+                <w:trHeight w:val="309"/>
+              </w:trPr>
+              <w:tc>
+                <w:tcPr>
+                  <w:tcW w:w="2232" w:type="dxa"/>
+                </w:tcPr>
+                <w:p>
+                  <w:pPr>
+                    <w:ind w:left="0"/>
+                  </w:pPr>
+                  <w:r>
+                    <w:t>{{ cores[</w:t>
+                  </w:r>
+                  <w:proofErr w:type="gramStart"/>
+                  <w:r>
+                    <w:t>2</w:t>
+                  </w:r>
+                  <w:r>
+                    <w:t>].</w:t>
+                  </w:r>
+                  <w:proofErr w:type="gramEnd"/>
+                  <w:r>
+                    <w:t>mark }}</w:t>
+                  </w:r>
+                </w:p>
+                <w:p>
+                  <w:pPr>
+                    <w:ind w:left="0"/>
+                  </w:pPr>
+                </w:p>
+              </w:tc>
+              <w:tc>
+                <w:tcPr>
+                  <w:tcW w:w="2160" w:type="dxa"/>
+                </w:tcPr>
+                <w:p>
+                  <w:pPr>
+                    <w:ind w:left="0"/>
+                  </w:pPr>
+                  <w:r>
+                    <w:t>{{ cores[</w:t>
+                  </w:r>
+                  <w:r>
+                    <w:t>2</w:t>
+                  </w:r>
+                  <w:r>
+                    <w:t>].lane }}</w:t>
+                  </w:r>
+                </w:p>
+                <w:p>
+                  <w:pPr>
+                    <w:ind w:left="0"/>
+                  </w:pPr>
+                </w:p>
+              </w:tc>
+              <w:tc>
+                <w:tcPr>
+                  <w:tcW w:w="3290" w:type="dxa"/>
+                </w:tcPr>
+                <w:p>
+                  <w:pPr>
+                    <w:ind w:left="0"/>
+                  </w:pPr>
+                  <w:r>
+                    <w:t>{{ cores[</w:t>
+                  </w:r>
+                  <w:r>
+                    <w:t>2</w:t>
+                  </w:r>
+                  <w:r>
+                    <w:t>].</w:t>
+                  </w:r>
+                  <w:proofErr w:type="spellStart"/>
+                  <w:r>
+                    <w:t>lane_station_ft</w:t>
+                  </w:r>
+                  <w:proofErr w:type="spellEnd"/>
+                  <w:r>
+                    <w:t xml:space="preserve"> }}</w:t>
+                  </w:r>
+                </w:p>
+                <w:p>
+                  <w:pPr>
+                    <w:ind w:left="0"/>
+                  </w:pPr>
+                </w:p>
+              </w:tc>
+              <w:tc>
+                <w:tcPr>
+                  <w:tcW w:w="2561" w:type="dxa"/>
+                </w:tcPr>
+                <w:p>
+                  <w:pPr>
+                    <w:ind w:left="0"/>
+                  </w:pPr>
+                  <w:r>
+                    <w:t>{{ cores[</w:t>
+                  </w:r>
+                  <w:r>
+                    <w:t>2</w:t>
+                  </w:r>
+                  <w:r>
+                    <w:t>].</w:t>
+                  </w:r>
+                  <w:proofErr w:type="spellStart"/>
+                  <w:r>
+                    <w:t>offset_ft</w:t>
+                  </w:r>
+                  <w:proofErr w:type="spellEnd"/>
+                  <w:r>
+                    <w:t xml:space="preserve"> }}</w:t>
+                  </w:r>
+                </w:p>
+                <w:p>
+                  <w:pPr>
+                    <w:ind w:left="0"/>
+                  </w:pPr>
+                </w:p>
+              </w:tc>
+            </w:tr>
+            <w:tr>
+              <w:trPr>
+                <w:trHeight w:val="322"/>
+              </w:trPr>
+              <w:tc>
+                <w:tcPr>
+                  <w:tcW w:w="2232" w:type="dxa"/>
+                </w:tcPr>
+                <w:p>
+                  <w:pPr>
+                    <w:ind w:left="0"/>
+                  </w:pPr>
+                  <w:r>
+                    <w:t>{{ cores[</w:t>
+                  </w:r>
+                  <w:r>
+                    <w:t>3</w:t>
+                  </w:r>
+                  <w:r>
+                    <w:t>].mark }}</w:t>
+                  </w:r>
+                </w:p>
+                <w:p>
+                  <w:pPr>
+                    <w:ind w:left="0"/>
+                  </w:pPr>
+                </w:p>
+              </w:tc>
+              <w:tc>
+                <w:tcPr>
+                  <w:tcW w:w="2160" w:type="dxa"/>
+                </w:tcPr>
+                <w:p>
+                  <w:pPr>
+                    <w:ind w:left="0"/>
+                  </w:pPr>
+                  <w:r>
+                    <w:t>{{ cores[</w:t>
+                  </w:r>
+                  <w:r>
+                    <w:t>3</w:t>
+                  </w:r>
+                  <w:r>
+                    <w:t>].lane }}</w:t>
+                  </w:r>
+                </w:p>
+                <w:p>
+                  <w:pPr>
+                    <w:ind w:left="0"/>
+                  </w:pPr>
+                </w:p>
+              </w:tc>
+              <w:tc>
+                <w:tcPr>
+                  <w:tcW w:w="3290" w:type="dxa"/>
+                </w:tcPr>
+                <w:p>
+                  <w:pPr>
+                    <w:ind w:left="0"/>
+                  </w:pPr>
+                  <w:r>
+                    <w:t>{{ cores[</w:t>
+                  </w:r>
+                  <w:r>
+                    <w:t>3</w:t>
+                  </w:r>
+                  <w:r>
+                    <w:t>].</w:t>
+                  </w:r>
+                  <w:proofErr w:type="spellStart"/>
+                  <w:r>
+                    <w:t>lane_station_ft</w:t>
+                  </w:r>
+                  <w:proofErr w:type="spellEnd"/>
+                  <w:r>
+                    <w:t xml:space="preserve"> }}</w:t>
+                  </w:r>
+                </w:p>
+                <w:p>
+                  <w:pPr>
+                    <w:ind w:left="0"/>
+                  </w:pPr>
+                </w:p>
+              </w:tc>
+              <w:tc>
+                <w:tcPr>
+                  <w:tcW w:w="2561" w:type="dxa"/>
+                </w:tcPr>
+                <w:p>
+                  <w:pPr>
+                    <w:ind w:left="0"/>
+                  </w:pPr>
+                  <w:r>
+                    <w:t>{{ cores[</w:t>
+                  </w:r>
+                  <w:r>
+                    <w:t>3</w:t>
+                  </w:r>
+                  <w:r>
+                    <w:t>].</w:t>
+                  </w:r>
+                  <w:proofErr w:type="spellStart"/>
+                  <w:r>
+                    <w:t>offset_ft</w:t>
+                  </w:r>
+                  <w:proofErr w:type="spellEnd"/>
+                  <w:r>
+                    <w:t xml:space="preserve"> }}</w:t>
+                  </w:r>
+                </w:p>
+                <w:p>
+                  <w:pPr>
+                    <w:ind w:left="0"/>
+                  </w:pPr>
+                </w:p>
+              </w:tc>
+            </w:tr>
+            <w:tr>
+              <w:trPr>
+                <w:trHeight w:val="322"/>
+              </w:trPr>
+              <w:tc>
+                <w:tcPr>
+                  <w:tcW w:w="2232" w:type="dxa"/>
+                </w:tcPr>
+                <w:p>
+                  <w:pPr>
+                    <w:ind w:left="0"/>
+                  </w:pPr>
+                  <w:r>
+                    <w:t>{{ cores[</w:t>
+                  </w:r>
+                  <w:r>
+                    <w:t>4</w:t>
+                  </w:r>
+                  <w:r>
+                    <w:t>].mark }}</w:t>
+                  </w:r>
+                </w:p>
+                <w:p>
+                  <w:pPr>
+                    <w:ind w:left="0"/>
+                  </w:pPr>
+                </w:p>
+              </w:tc>
+              <w:tc>
+                <w:tcPr>
+                  <w:tcW w:w="2160" w:type="dxa"/>
+                </w:tcPr>
+                <w:p>
+                  <w:pPr>
+                    <w:ind w:left="0"/>
+                  </w:pPr>
+                  <w:r>
+                    <w:t>{{ cores[</w:t>
+                  </w:r>
+                  <w:r>
+                    <w:t>4</w:t>
+                  </w:r>
+                  <w:r>
+                    <w:t>].lane }}</w:t>
+                  </w:r>
+                </w:p>
+                <w:p>
+                  <w:pPr>
+                    <w:ind w:left="0"/>
+                  </w:pPr>
+                </w:p>
+              </w:tc>
+              <w:tc>
+                <w:tcPr>
+                  <w:tcW w:w="3290" w:type="dxa"/>
+                </w:tcPr>
+                <w:p>
+                  <w:pPr>
+                    <w:ind w:left="0"/>
+                  </w:pPr>
+                  <w:r>
+                    <w:t>{{ cores[</w:t>
+                  </w:r>
+                  <w:r>
+                    <w:t>4</w:t>
+                  </w:r>
+                  <w:r>
+                    <w:t>].</w:t>
+                  </w:r>
+                  <w:proofErr w:type="spellStart"/>
+                  <w:r>
+                    <w:t>lane_station_ft</w:t>
+                  </w:r>
+                  <w:proofErr w:type="spellEnd"/>
+                  <w:r>
+                    <w:t xml:space="preserve"> }}</w:t>
+                  </w:r>
+                </w:p>
+                <w:p>
+                  <w:pPr>
+                    <w:ind w:left="0"/>
+                  </w:pPr>
+                </w:p>
+              </w:tc>
+              <w:tc>
+                <w:tcPr>
+                  <w:tcW w:w="2561" w:type="dxa"/>
+                </w:tcPr>
+                <w:p>
+                  <w:pPr>
+                    <w:ind w:left="0"/>
+                  </w:pPr>
+                  <w:r>
+                    <w:t>{{ cores[</w:t>
+                  </w:r>
+                  <w:r>
+                    <w:t>4</w:t>
+                  </w:r>
+                  <w:r>
+                    <w:t>].</w:t>
+                  </w:r>
+                  <w:proofErr w:type="spellStart"/>
+                  <w:r>
+                    <w:t>offset_ft</w:t>
+                  </w:r>
+                  <w:proofErr w:type="spellEnd"/>
+                  <w:r>
+                    <w:t xml:space="preserve"> }}</w:t>
+                  </w:r>
+                </w:p>
+                <w:p>
+                  <w:pPr>
+                    <w:ind w:left="0"/>
+                  </w:pPr>
+                </w:p>
+              </w:tc>
+            </w:tr>
+            <w:tr>
+              <w:trPr>
+                <w:trHeight w:val="322"/>
+              </w:trPr>
+              <w:tc>
+                <w:tcPr>
+                  <w:tcW w:w="2232" w:type="dxa"/>
+                </w:tcPr>
+                <w:p>
+                  <w:pPr>
+                    <w:ind w:left="0"/>
+                  </w:pPr>
+                  <w:r>
+                    <w:lastRenderedPageBreak/>
+                    <w:t>{{ cores[</w:t>
+                  </w:r>
+                  <w:r>
+                    <w:t>5</w:t>
+                  </w:r>
+                  <w:r>
+                    <w:t>].mark }}</w:t>
+                  </w:r>
+                </w:p>
+                <w:p>
+                  <w:pPr>
+                    <w:ind w:left="0"/>
+                  </w:pPr>
+                </w:p>
+              </w:tc>
+              <w:tc>
+                <w:tcPr>
+                  <w:tcW w:w="2160" w:type="dxa"/>
+                </w:tcPr>
+                <w:p>
+                  <w:pPr>
+                    <w:ind w:left="0"/>
+                  </w:pPr>
+                  <w:r>
+                    <w:t>{{ cores[</w:t>
+                  </w:r>
+                  <w:r>
+                    <w:t>5</w:t>
+                  </w:r>
+                  <w:r>
+                    <w:t>].lane }}</w:t>
+                  </w:r>
+                </w:p>
+                <w:p>
+                  <w:pPr>
+                    <w:ind w:left="0"/>
+                  </w:pPr>
+                </w:p>
+              </w:tc>
+              <w:tc>
+                <w:tcPr>
+                  <w:tcW w:w="3290" w:type="dxa"/>
+                </w:tcPr>
+                <w:p>
+                  <w:pPr>
+                    <w:ind w:left="0"/>
+                  </w:pPr>
+                  <w:r>
+                    <w:t>{{ cores[</w:t>
+                  </w:r>
+                  <w:r>
+                    <w:t>5</w:t>
+                  </w:r>
+                  <w:r>
+                    <w:t>].</w:t>
+                  </w:r>
+                  <w:proofErr w:type="spellStart"/>
+                  <w:r>
+                    <w:t>lane_station_ft</w:t>
+                  </w:r>
+                  <w:proofErr w:type="spellEnd"/>
+                  <w:r>
+                    <w:t xml:space="preserve"> }}</w:t>
+                  </w:r>
+                </w:p>
+                <w:p>
+                  <w:pPr>
+                    <w:ind w:left="0"/>
+                  </w:pPr>
+                </w:p>
+              </w:tc>
+              <w:tc>
+                <w:tcPr>
+                  <w:tcW w:w="2561" w:type="dxa"/>
+                </w:tcPr>
+                <w:p>
+                  <w:pPr>
+                    <w:ind w:left="0"/>
+                  </w:pPr>
+                  <w:r>
+                    <w:t>{{ cores[</w:t>
+                  </w:r>
+                  <w:r>
+                    <w:t>5</w:t>
+                  </w:r>
+                  <w:r>
+                    <w:t>].</w:t>
+                  </w:r>
+                  <w:proofErr w:type="spellStart"/>
+                  <w:r>
+                    <w:t>offset_ft</w:t>
+                  </w:r>
+                  <w:proofErr w:type="spellEnd"/>
+                  <w:r>
+                    <w:t xml:space="preserve"> }}</w:t>
+                  </w:r>
+                </w:p>
+                <w:p>
+                  <w:pPr>
+                    <w:ind w:left="0"/>
+                  </w:pPr>
+                </w:p>
+              </w:tc>
+            </w:tr>
+            <w:tr>
+              <w:trPr>
+                <w:trHeight w:val="322"/>
+              </w:trPr>
+              <w:tc>
+                <w:tcPr>
+                  <w:tcW w:w="2232" w:type="dxa"/>
+                </w:tcPr>
+                <w:p>
+                  <w:pPr>
+                    <w:ind w:left="0"/>
+                  </w:pPr>
+                  <w:r>
+                    <w:t>{{ cores[</w:t>
+                  </w:r>
+                  <w:r>
+                    <w:t>6</w:t>
+                  </w:r>
+                  <w:r>
+                    <w:t>].mark }}</w:t>
+                  </w:r>
+                </w:p>
+                <w:p>
+                  <w:pPr>
+                    <w:ind w:left="0"/>
+                    <w:jc w:val="center"/>
+                  </w:pPr>
+                </w:p>
+              </w:tc>
+              <w:tc>
+                <w:tcPr>
+                  <w:tcW w:w="2160" w:type="dxa"/>
+                </w:tcPr>
+                <w:p>
+                  <w:pPr>
+                    <w:ind w:left="0"/>
+                  </w:pPr>
+                  <w:r>
+                    <w:t>{{ cores[</w:t>
+                  </w:r>
+                  <w:r>
+                    <w:t>6</w:t>
+                  </w:r>
+                  <w:r>
+                    <w:t>].lane }}</w:t>
+                  </w:r>
+                </w:p>
+                <w:p>
+                  <w:pPr>
+                    <w:ind w:left="0"/>
+                    <w:jc w:val="center"/>
+                  </w:pPr>
+                </w:p>
+              </w:tc>
+              <w:tc>
+                <w:tcPr>
+                  <w:tcW w:w="3290" w:type="dxa"/>
+                </w:tcPr>
+                <w:p>
+                  <w:pPr>
+                    <w:ind w:left="0"/>
+                  </w:pPr>
+                  <w:r>
+                    <w:t>{{ cores[</w:t>
+                  </w:r>
+                  <w:r>
+                    <w:t>6</w:t>
+                  </w:r>
+                  <w:r>
+                    <w:t>].</w:t>
+                  </w:r>
+                  <w:proofErr w:type="spellStart"/>
+                  <w:r>
+                    <w:t>lane_station_ft</w:t>
+                  </w:r>
+                  <w:proofErr w:type="spellEnd"/>
+                  <w:r>
+                    <w:t xml:space="preserve"> }}</w:t>
+                  </w:r>
+                </w:p>
+                <w:p>
+                  <w:pPr>
+                    <w:ind w:left="0"/>
+                    <w:jc w:val="center"/>
+                  </w:pPr>
+                </w:p>
+              </w:tc>
+              <w:tc>
+                <w:tcPr>
+                  <w:tcW w:w="2561" w:type="dxa"/>
+                </w:tcPr>
+                <w:p>
+                  <w:pPr>
+                    <w:ind w:left="0"/>
+                  </w:pPr>
+                  <w:r>
+                    <w:t>{{ cores[</w:t>
+                  </w:r>
+                  <w:r>
+                    <w:t>6</w:t>
+                  </w:r>
+                  <w:r>
+                    <w:t>].</w:t>
+                  </w:r>
+                  <w:proofErr w:type="spellStart"/>
+                  <w:r>
+                    <w:t>offset_ft</w:t>
+                  </w:r>
+                  <w:proofErr w:type="spellEnd"/>
+                  <w:r>
+                    <w:t xml:space="preserve"> }}</w:t>
+                  </w:r>
+                </w:p>
+                <w:p>
+                  <w:pPr>
+                    <w:ind w:left="0"/>
+                    <w:jc w:val="center"/>
+                  </w:pPr>
+                </w:p>
+              </w:tc>
+            </w:tr>
+            <w:tr>
+              <w:trPr>
+                <w:trHeight w:val="322"/>
+              </w:trPr>
+              <w:tc>
+                <w:tcPr>
+                  <w:tcW w:w="2232" w:type="dxa"/>
+                </w:tcPr>
+                <w:p>
+                  <w:pPr>
+                    <w:ind w:left="0"/>
+                  </w:pPr>
+                  <w:r>
+                    <w:t>{{ cores[</w:t>
+                  </w:r>
+                  <w:r>
+                    <w:t>7</w:t>
+                  </w:r>
+                  <w:r>
+                    <w:t>].mark }}</w:t>
+                  </w:r>
+                </w:p>
+                <w:p>
+                  <w:pPr>
+                    <w:ind w:left="0"/>
+                    <w:jc w:val="center"/>
+                  </w:pPr>
+                </w:p>
+              </w:tc>
+              <w:tc>
+                <w:tcPr>
+                  <w:tcW w:w="2160" w:type="dxa"/>
+                </w:tcPr>
+                <w:p>
+                  <w:pPr>
+                    <w:ind w:left="0"/>
+                  </w:pPr>
+                  <w:r>
+                    <w:t>{{ cores[</w:t>
+                  </w:r>
+                  <w:r>
+                    <w:t>7</w:t>
+                  </w:r>
+                  <w:r>
+                    <w:t>].lane }}</w:t>
+                  </w:r>
+                </w:p>
+                <w:p>
+                  <w:pPr>
+                    <w:ind w:left="0"/>
+                    <w:jc w:val="center"/>
+                  </w:pPr>
+                </w:p>
+              </w:tc>
+              <w:tc>
+                <w:tcPr>
+                  <w:tcW w:w="3290" w:type="dxa"/>
+                </w:tcPr>
+                <w:p>
+                  <w:pPr>
+                    <w:ind w:left="0"/>
+                  </w:pPr>
+                  <w:r>
+                    <w:t>{{ cores[</w:t>
+                  </w:r>
+                  <w:r>
+                    <w:t>7</w:t>
+                  </w:r>
+                  <w:r>
+                    <w:t>].</w:t>
+                  </w:r>
+                  <w:proofErr w:type="spellStart"/>
+                  <w:r>
+                    <w:t>lane_station_ft</w:t>
+                  </w:r>
+                  <w:proofErr w:type="spellEnd"/>
+                  <w:r>
+                    <w:t xml:space="preserve"> }}</w:t>
+                  </w:r>
+                </w:p>
+                <w:p>
+                  <w:pPr>
+                    <w:ind w:left="0"/>
+                    <w:jc w:val="center"/>
+                  </w:pPr>
+                </w:p>
+              </w:tc>
+              <w:tc>
+                <w:tcPr>
+                  <w:tcW w:w="2561" w:type="dxa"/>
+                </w:tcPr>
+                <w:p>
+                  <w:pPr>
+                    <w:ind w:left="0"/>
+                  </w:pPr>
+                  <w:r>
+                    <w:t>{{ cores[</w:t>
+                  </w:r>
+                  <w:r>
+                    <w:t>7</w:t>
+                  </w:r>
+                  <w:r>
+                    <w:t>].</w:t>
+                  </w:r>
+                  <w:proofErr w:type="spellStart"/>
+                  <w:r>
+                    <w:t>offset_ft</w:t>
+                  </w:r>
+                  <w:proofErr w:type="spellEnd"/>
+                  <w:r>
+                    <w:t xml:space="preserve"> }}</w:t>
+                  </w:r>
+                </w:p>
+                <w:p>
+                  <w:pPr>
+                    <w:ind w:left="0"/>
+                    <w:jc w:val="center"/>
+                  </w:pPr>
+                </w:p>
+              </w:tc>
+            </w:tr>
+            <w:tr>
+              <w:trPr>
+                <w:trHeight w:val="322"/>
+              </w:trPr>
+              <w:tc>
+                <w:tcPr>
+                  <w:tcW w:w="2232" w:type="dxa"/>
+                </w:tcPr>
+                <w:p>
+                  <w:pPr>
+                    <w:ind w:left="0"/>
+                  </w:pPr>
+                  <w:r>
+                    <w:t>{{ cores[</w:t>
+                  </w:r>
+                  <w:r>
+                    <w:t>8</w:t>
+                  </w:r>
+                  <w:r>
+                    <w:t>].mark }}</w:t>
+                  </w:r>
+                </w:p>
+                <w:p>
+                  <w:pPr>
+                    <w:ind w:left="0"/>
+                    <w:jc w:val="center"/>
+                  </w:pPr>
+                </w:p>
+              </w:tc>
+              <w:tc>
+                <w:tcPr>
+                  <w:tcW w:w="2160" w:type="dxa"/>
+                </w:tcPr>
+                <w:p>
+                  <w:pPr>
+                    <w:ind w:left="0"/>
+                  </w:pPr>
+                  <w:r>
+                    <w:t>{{ cores[</w:t>
+                  </w:r>
+                  <w:r>
+                    <w:t>8</w:t>
+                  </w:r>
+                  <w:r>
+                    <w:t>].lane }}</w:t>
+                  </w:r>
+                </w:p>
+                <w:p>
+                  <w:pPr>
+                    <w:ind w:left="0"/>
+                    <w:jc w:val="center"/>
+                  </w:pPr>
+                </w:p>
+              </w:tc>
+              <w:tc>
+                <w:tcPr>
+                  <w:tcW w:w="3290" w:type="dxa"/>
+                </w:tcPr>
+                <w:p>
+                  <w:pPr>
+                    <w:ind w:left="0"/>
+                  </w:pPr>
+                  <w:r>
+                    <w:t>{{ cores[</w:t>
+                  </w:r>
+                  <w:r>
+                    <w:t>8</w:t>
+                  </w:r>
+                  <w:r>
+                    <w:t>].</w:t>
+                  </w:r>
+                  <w:proofErr w:type="spellStart"/>
+                  <w:r>
+                    <w:t>lane_station_ft</w:t>
+                  </w:r>
+                  <w:proofErr w:type="spellEnd"/>
+                  <w:r>
+                    <w:t xml:space="preserve"> }}</w:t>
+                  </w:r>
+                </w:p>
+                <w:p>
+                  <w:pPr>
+                    <w:ind w:left="0"/>
+                    <w:jc w:val="center"/>
+                  </w:pPr>
+                </w:p>
+              </w:tc>
+              <w:tc>
+                <w:tcPr>
+                  <w:tcW w:w="2561" w:type="dxa"/>
+                </w:tcPr>
+                <w:p>
+                  <w:pPr>
+                    <w:ind w:left="0"/>
+                  </w:pPr>
+                  <w:r>
+                    <w:t>{{ cores[</w:t>
+                  </w:r>
+                  <w:r>
+                    <w:t>8</w:t>
+                  </w:r>
+                  <w:r>
+                    <w:t>].</w:t>
+                  </w:r>
+                  <w:proofErr w:type="spellStart"/>
+                  <w:r>
+                    <w:t>offset_ft</w:t>
+                  </w:r>
+                  <w:proofErr w:type="spellEnd"/>
+                  <w:r>
+                    <w:t xml:space="preserve"> }}</w:t>
+                  </w:r>
+                </w:p>
+                <w:p>
+                  <w:pPr>
+                    <w:ind w:left="0"/>
+                    <w:jc w:val="center"/>
+                  </w:pPr>
+                </w:p>
+              </w:tc>
+            </w:tr>
+          </w:tbl>
+          <w:p>
+            <w:r>
+              <w:t>{% endif %}</w:t>
+            </w:r>
+          </w:p>
+          <w:p/>
+          <w:p/>
+          <w:p>
             <w:pPr>
               <w:pStyle w:val="Heading2"/>
             </w:pPr>
@@ -1316,6 +2541,7 @@
         <w:ind w:left="0"/>
       </w:pPr>
       <w:r>
+        <w:lastRenderedPageBreak/>
         <w:br w:type="page"/>
       </w:r>
     </w:p>
@@ -9109,12 +10335,19 @@
 </file>
 
 <file path=customXml/item1.xml><?xml version="1.0" encoding="utf-8"?>
-<p:properties xmlns:p="http://schemas.microsoft.com/office/2006/metadata/properties" xmlns:xsi="http://www.w3.org/2001/XMLSchema-instance" xmlns:pc="http://schemas.microsoft.com/office/infopath/2007/PartnerControls">
-  <documentManagement/>
-</p:properties>
+<b:Sources xmlns:b="http://schemas.openxmlformats.org/officeDocument/2006/bibliography" xmlns="http://schemas.openxmlformats.org/officeDocument/2006/bibliography" SelectedStyle="\APASixthEditionOfficeOnline.xsl" StyleName="APA" Version="6"/>
 </file>
 
 <file path=customXml/item2.xml><?xml version="1.0" encoding="utf-8"?>
+<?mso-contentType ?>
+<FormTemplates xmlns="http://schemas.microsoft.com/sharepoint/v3/contenttype/forms">
+  <Display>DocumentLibraryForm</Display>
+  <Edit>DocumentLibraryForm</Edit>
+  <New>DocumentLibraryForm</New>
+</FormTemplates>
+</file>
+
+<file path=customXml/item3.xml><?xml version="1.0" encoding="utf-8"?>
 <ct:contentTypeSchema xmlns:ct="http://schemas.microsoft.com/office/2006/metadata/contentType" xmlns:ma="http://schemas.microsoft.com/office/2006/metadata/properties/metaAttributes" ct:_="" ma:_="" ma:contentTypeName="Document" ma:contentTypeID="0x01010009C8F9FEE533ED4B810C6D79F3C505E6" ma:contentTypeVersion="11" ma:contentTypeDescription="Create a new document." ma:contentTypeScope="" ma:versionID="1fb8cb7a25627d9c09838a547b389cb2">
   <xsd:schema xmlns:xsd="http://www.w3.org/2001/XMLSchema" xmlns:xs="http://www.w3.org/2001/XMLSchema" xmlns:p="http://schemas.microsoft.com/office/2006/metadata/properties" xmlns:ns2="c0b7ad90-c821-4148-a83c-8a2325b8573f" xmlns:ns3="3c2cab0a-22f4-449c-9a77-5bb99896b17f" targetNamespace="http://schemas.microsoft.com/office/2006/metadata/properties" ma:root="true" ma:fieldsID="be9d54ad2a7e817d3240b8c634474899" ns2:_="" ns3:_="">
     <xsd:import namespace="c0b7ad90-c821-4148-a83c-8a2325b8573f"/>
@@ -9325,29 +10558,29 @@
 </ct:contentTypeSchema>
 </file>
 
-<file path=customXml/item3.xml><?xml version="1.0" encoding="utf-8"?>
-<?mso-contentType ?>
-<FormTemplates xmlns="http://schemas.microsoft.com/sharepoint/v3/contenttype/forms">
-  <Display>DocumentLibraryForm</Display>
-  <Edit>DocumentLibraryForm</Edit>
-  <New>DocumentLibraryForm</New>
-</FormTemplates>
-</file>
-
 <file path=customXml/item4.xml><?xml version="1.0" encoding="utf-8"?>
-<b:Sources xmlns:b="http://schemas.openxmlformats.org/officeDocument/2006/bibliography" xmlns="http://schemas.openxmlformats.org/officeDocument/2006/bibliography" SelectedStyle="\APASixthEditionOfficeOnline.xsl" StyleName="APA" Version="6"/>
+<p:properties xmlns:p="http://schemas.microsoft.com/office/2006/metadata/properties" xmlns:xsi="http://www.w3.org/2001/XMLSchema-instance" xmlns:pc="http://schemas.microsoft.com/office/infopath/2007/PartnerControls">
+  <documentManagement/>
+</p:properties>
 </file>
 
 <file path=customXml/itemProps1.xml><?xml version="1.0" encoding="utf-8"?>
-<ds:datastoreItem xmlns:ds="http://schemas.openxmlformats.org/officeDocument/2006/customXml" ds:itemID="{6BA02646-2EFC-4A76-8B94-9611CADBCCD8}">
+<ds:datastoreItem xmlns:ds="http://schemas.openxmlformats.org/officeDocument/2006/customXml" ds:itemID="{A22438A6-B54B-4884-A591-E5C85E85C45B}">
   <ds:schemaRefs>
-    <ds:schemaRef ds:uri="http://schemas.microsoft.com/office/2006/metadata/properties"/>
-    <ds:schemaRef ds:uri="http://schemas.microsoft.com/office/infopath/2007/PartnerControls"/>
+    <ds:schemaRef ds:uri="http://schemas.openxmlformats.org/officeDocument/2006/bibliography"/>
   </ds:schemaRefs>
 </ds:datastoreItem>
 </file>
 
 <file path=customXml/itemProps2.xml><?xml version="1.0" encoding="utf-8"?>
+<ds:datastoreItem xmlns:ds="http://schemas.openxmlformats.org/officeDocument/2006/customXml" ds:itemID="{5AB9ABBB-705E-43E1-81F2-8BBA228A764C}">
+  <ds:schemaRefs>
+    <ds:schemaRef ds:uri="http://schemas.microsoft.com/sharepoint/v3/contenttype/forms"/>
+  </ds:schemaRefs>
+</ds:datastoreItem>
+</file>
+
+<file path=customXml/itemProps3.xml><?xml version="1.0" encoding="utf-8"?>
 <ds:datastoreItem xmlns:ds="http://schemas.openxmlformats.org/officeDocument/2006/customXml" ds:itemID="{87B80006-69E9-4415-8889-73FD6F928AB7}">
   <ds:schemaRefs>
     <ds:schemaRef ds:uri="http://schemas.microsoft.com/office/2006/metadata/contentType"/>
@@ -9366,18 +10599,11 @@
 </ds:datastoreItem>
 </file>
 
-<file path=customXml/itemProps3.xml><?xml version="1.0" encoding="utf-8"?>
-<ds:datastoreItem xmlns:ds="http://schemas.openxmlformats.org/officeDocument/2006/customXml" ds:itemID="{5AB9ABBB-705E-43E1-81F2-8BBA228A764C}">
+<file path=customXml/itemProps4.xml><?xml version="1.0" encoding="utf-8"?>
+<ds:datastoreItem xmlns:ds="http://schemas.openxmlformats.org/officeDocument/2006/customXml" ds:itemID="{6BA02646-2EFC-4A76-8B94-9611CADBCCD8}">
   <ds:schemaRefs>
-    <ds:schemaRef ds:uri="http://schemas.microsoft.com/sharepoint/v3/contenttype/forms"/>
-  </ds:schemaRefs>
-</ds:datastoreItem>
-</file>
-
-<file path=customXml/itemProps4.xml><?xml version="1.0" encoding="utf-8"?>
-<ds:datastoreItem xmlns:ds="http://schemas.openxmlformats.org/officeDocument/2006/customXml" ds:itemID="{A22438A6-B54B-4884-A591-E5C85E85C45B}">
-  <ds:schemaRefs>
-    <ds:schemaRef ds:uri="http://schemas.openxmlformats.org/officeDocument/2006/bibliography"/>
+    <ds:schemaRef ds:uri="http://schemas.microsoft.com/office/2006/metadata/properties"/>
+    <ds:schemaRef ds:uri="http://schemas.microsoft.com/office/infopath/2007/PartnerControls"/>
   </ds:schemaRefs>
 </ds:datastoreItem>
 </file>
</xml_diff>